<commit_message>
Add error-conditions pipeline lab and organize cycle calculator images
Add the Day 3 SK3 L3 lab on error conditions within a computation
pipeline (source, doc, and screenshots), and move the cycle calculator
image into a per-lab folder alongside its makerchip diagram and waveform.
</commit_message>
<xml_diff>
--- a/Day_3_4_5/docs/RV_D3SK3_L4_Lab-2_Cycle_Calculator.docx
+++ b/Day_3_4_5/docs/RV_D3SK3_L4_Lab-2_Cycle_Calculator.docx
@@ -23,27 +23,28 @@
       <w:r>
         <w:t xml:space="preserve">This note explains </w:t>
       </w:r>
+      <w:r>
+        <w:rPr>
+          <w:b/>
+          <w:bCs/>
+        </w:rPr>
+        <w:t>RV_D3SK3_L4_Lab-2_Cycle_Calculator</w:t>
+      </w:r>
+      <w:r>
+        <w:rPr>
+          <w:b/>
+          <w:bCs/>
+        </w:rPr>
+        <w:t>.v</w:t>
+      </w:r>
+      <w:r>
+        <w:t xml:space="preserve">, a small calculator that adds, subtracts, multiplies or divides two operands and feeds each valid result back in as the next first operand. It is written for </w:t>
+      </w:r>
       <w:proofErr w:type="spellStart"/>
       <w:r>
-        <w:t>calc_</w:t>
-      </w:r>
-      <w:proofErr w:type="gramStart"/>
-      <w:r>
-        <w:t>pipeline.</w:t>
-      </w:r>
-      <w:r>
-        <w:t>v</w:t>
+        <w:t>Makerchip</w:t>
       </w:r>
       <w:proofErr w:type="spellEnd"/>
-      <w:proofErr w:type="gramEnd"/>
-      <w:r>
-        <w:t xml:space="preserve">, a small calculator that adds, subtracts, multiplies or divides two operands and feeds each valid result back in as the next first operand. It is written for </w:t>
-      </w:r>
-      <w:proofErr w:type="spellStart"/>
-      <w:r>
-        <w:t>Makerchip</w:t>
-      </w:r>
-      <w:proofErr w:type="spellEnd"/>
       <w:r>
         <w:t xml:space="preserve"> and follows the pipeline diagram: two stage lines, a &gt;&gt;2 result recirculation, a &gt;&gt;1 valid toggle, and an inverter and OR gate that zero the output.</w:t>
       </w:r>
@@ -61,10 +62,13 @@
         <w:spacing w:after="120"/>
       </w:pPr>
       <w:r>
+        <w:rPr>
+          <w:noProof/>
+        </w:rPr>
         <w:drawing>
-          <wp:inline distT="0" distB="0" distL="0" distR="0" wp14:anchorId="1745C07B" wp14:editId="25609D15">
+          <wp:inline distT="0" distB="0" distL="0" distR="0" wp14:anchorId="1745C07B" wp14:editId="7595C946">
             <wp:extent cx="4312920" cy="2669653"/>
-            <wp:effectExtent l="0" t="0" r="0" b="0"/>
+            <wp:effectExtent l="19050" t="19050" r="11430" b="16510"/>
             <wp:docPr id="805970044" name="Picture 1"/>
             <wp:cNvGraphicFramePr>
               <a:graphicFrameLocks xmlns:a="http://schemas.openxmlformats.org/drawingml/2006/main" noChangeAspect="1"/>
@@ -90,6 +94,11 @@
                     <a:prstGeom prst="rect">
                       <a:avLst/>
                     </a:prstGeom>
+                    <a:ln>
+                      <a:solidFill>
+                        <a:schemeClr val="accent1"/>
+                      </a:solidFill>
+                    </a:ln>
                   </pic:spPr>
                 </pic:pic>
               </a:graphicData>
@@ -111,10 +120,13 @@
         <w:spacing w:after="120"/>
       </w:pPr>
       <w:r>
+        <w:rPr>
+          <w:noProof/>
+        </w:rPr>
         <w:drawing>
-          <wp:inline distT="0" distB="0" distL="0" distR="0" wp14:anchorId="3D91CFE3" wp14:editId="54CF52F1">
-            <wp:extent cx="4234038" cy="3870960"/>
-            <wp:effectExtent l="0" t="0" r="7620" b="0"/>
+          <wp:inline distT="0" distB="0" distL="0" distR="0" wp14:anchorId="3D91CFE3" wp14:editId="2C773D1B">
+            <wp:extent cx="4301490" cy="3870509"/>
+            <wp:effectExtent l="19050" t="19050" r="22860" b="15875"/>
             <wp:docPr id="1125721488" name="Picture 1"/>
             <wp:cNvGraphicFramePr>
               <a:graphicFrameLocks xmlns:a="http://schemas.openxmlformats.org/drawingml/2006/main" noChangeAspect="1"/>
@@ -135,11 +147,16 @@
                   <pic:spPr>
                     <a:xfrm>
                       <a:off x="0" y="0"/>
-                      <a:ext cx="4234038" cy="3870960"/>
+                      <a:ext cx="4302809" cy="3871696"/>
                     </a:xfrm>
                     <a:prstGeom prst="rect">
                       <a:avLst/>
                     </a:prstGeom>
+                    <a:ln>
+                      <a:solidFill>
+                        <a:schemeClr val="accent1"/>
+                      </a:solidFill>
+                    </a:ln>
                   </pic:spPr>
                 </pic:pic>
               </a:graphicData>
@@ -150,14 +167,181 @@
     </w:p>
     <w:p>
       <w:pPr>
+        <w:pStyle w:val="Heading1"/>
+      </w:pPr>
+      <w:proofErr w:type="spellStart"/>
+      <w:r>
+        <w:lastRenderedPageBreak/>
+        <w:t>Makerchip</w:t>
+      </w:r>
+      <w:proofErr w:type="spellEnd"/>
+      <w:r>
+        <w:t xml:space="preserve"> execution – Diagram</w:t>
+      </w:r>
+    </w:p>
+    <w:p>
+      <w:pPr>
         <w:spacing w:after="120"/>
       </w:pPr>
+      <w:r>
+        <w:rPr>
+          <w:noProof/>
+        </w:rPr>
+        <w:drawing>
+          <wp:inline distT="0" distB="0" distL="0" distR="0" wp14:anchorId="4B427806" wp14:editId="39EEB0DD">
+            <wp:extent cx="5731510" cy="3305810"/>
+            <wp:effectExtent l="19050" t="19050" r="21590" b="27940"/>
+            <wp:docPr id="2047142682" name="Picture 2"/>
+            <wp:cNvGraphicFramePr>
+              <a:graphicFrameLocks xmlns:a="http://schemas.openxmlformats.org/drawingml/2006/main" noChangeAspect="1"/>
+            </wp:cNvGraphicFramePr>
+            <a:graphic xmlns:a="http://schemas.openxmlformats.org/drawingml/2006/main">
+              <a:graphicData uri="http://schemas.openxmlformats.org/drawingml/2006/picture">
+                <pic:pic xmlns:pic="http://schemas.openxmlformats.org/drawingml/2006/picture">
+                  <pic:nvPicPr>
+                    <pic:cNvPr id="0" name="Picture 6"/>
+                    <pic:cNvPicPr>
+                      <a:picLocks noChangeAspect="1" noChangeArrowheads="1"/>
+                    </pic:cNvPicPr>
+                  </pic:nvPicPr>
+                  <pic:blipFill>
+                    <a:blip r:embed="rId9" cstate="print">
+                      <a:extLst>
+                        <a:ext uri="{28A0092B-C50C-407E-A947-70E740481C1C}">
+                          <a14:useLocalDpi xmlns:a14="http://schemas.microsoft.com/office/drawing/2010/main" val="0"/>
+                        </a:ext>
+                      </a:extLst>
+                    </a:blip>
+                    <a:srcRect/>
+                    <a:stretch>
+                      <a:fillRect/>
+                    </a:stretch>
+                  </pic:blipFill>
+                  <pic:spPr bwMode="auto">
+                    <a:xfrm>
+                      <a:off x="0" y="0"/>
+                      <a:ext cx="5731510" cy="3305810"/>
+                    </a:xfrm>
+                    <a:prstGeom prst="rect">
+                      <a:avLst/>
+                    </a:prstGeom>
+                    <a:noFill/>
+                    <a:ln>
+                      <a:solidFill>
+                        <a:schemeClr val="accent1"/>
+                      </a:solidFill>
+                    </a:ln>
+                  </pic:spPr>
+                </pic:pic>
+              </a:graphicData>
+            </a:graphic>
+          </wp:inline>
+        </w:drawing>
+      </w:r>
+    </w:p>
+    <w:p>
+      <w:pPr>
+        <w:spacing w:after="120"/>
+      </w:pPr>
     </w:p>
     <w:p>
       <w:pPr>
         <w:pStyle w:val="Heading1"/>
       </w:pPr>
-      <w:r>
+      <w:proofErr w:type="spellStart"/>
+      <w:r>
+        <w:t>Makerchip</w:t>
+      </w:r>
+      <w:proofErr w:type="spellEnd"/>
+      <w:r>
+        <w:t xml:space="preserve"> execution – Waveform</w:t>
+      </w:r>
+    </w:p>
+    <w:p>
+      <w:pPr>
+        <w:spacing w:after="120"/>
+      </w:pPr>
+    </w:p>
+    <w:p>
+      <w:pPr>
+        <w:spacing w:after="120"/>
+      </w:pPr>
+      <w:r>
+        <w:rPr>
+          <w:noProof/>
+        </w:rPr>
+        <w:drawing>
+          <wp:inline distT="0" distB="0" distL="0" distR="0" wp14:anchorId="6AEB16FC" wp14:editId="3DE9E54C">
+            <wp:extent cx="5722620" cy="3185160"/>
+            <wp:effectExtent l="19050" t="19050" r="11430" b="15240"/>
+            <wp:docPr id="2120765742" name="Picture 3"/>
+            <wp:cNvGraphicFramePr>
+              <a:graphicFrameLocks xmlns:a="http://schemas.openxmlformats.org/drawingml/2006/main" noChangeAspect="1"/>
+            </wp:cNvGraphicFramePr>
+            <a:graphic xmlns:a="http://schemas.openxmlformats.org/drawingml/2006/main">
+              <a:graphicData uri="http://schemas.openxmlformats.org/drawingml/2006/picture">
+                <pic:pic xmlns:pic="http://schemas.openxmlformats.org/drawingml/2006/picture">
+                  <pic:nvPicPr>
+                    <pic:cNvPr id="0" name="Picture 8"/>
+                    <pic:cNvPicPr>
+                      <a:picLocks noChangeAspect="1" noChangeArrowheads="1"/>
+                    </pic:cNvPicPr>
+                  </pic:nvPicPr>
+                  <pic:blipFill>
+                    <a:blip r:embed="rId10" cstate="print">
+                      <a:extLst>
+                        <a:ext uri="{28A0092B-C50C-407E-A947-70E740481C1C}">
+                          <a14:useLocalDpi xmlns:a14="http://schemas.microsoft.com/office/drawing/2010/main" val="0"/>
+                        </a:ext>
+                      </a:extLst>
+                    </a:blip>
+                    <a:srcRect/>
+                    <a:stretch>
+                      <a:fillRect/>
+                    </a:stretch>
+                  </pic:blipFill>
+                  <pic:spPr bwMode="auto">
+                    <a:xfrm>
+                      <a:off x="0" y="0"/>
+                      <a:ext cx="5722620" cy="3185160"/>
+                    </a:xfrm>
+                    <a:prstGeom prst="rect">
+                      <a:avLst/>
+                    </a:prstGeom>
+                    <a:noFill/>
+                    <a:ln>
+                      <a:solidFill>
+                        <a:schemeClr val="accent1"/>
+                      </a:solidFill>
+                    </a:ln>
+                  </pic:spPr>
+                </pic:pic>
+              </a:graphicData>
+            </a:graphic>
+          </wp:inline>
+        </w:drawing>
+      </w:r>
+    </w:p>
+    <w:p>
+      <w:pPr>
+        <w:rPr>
+          <w:b/>
+          <w:bCs/>
+          <w:color w:val="1F3864"/>
+          <w:sz w:val="30"/>
+          <w:szCs w:val="30"/>
+        </w:rPr>
+      </w:pPr>
+      <w:r>
+        <w:br w:type="page"/>
+      </w:r>
+    </w:p>
+    <w:p>
+      <w:pPr>
+        <w:pStyle w:val="Heading1"/>
+      </w:pPr>
+      <w:r>
+        <w:lastRenderedPageBreak/>
         <w:t>Implementation Elaboration</w:t>
       </w:r>
     </w:p>
@@ -191,12 +375,6 @@
         <w:gridCol w:w="6826"/>
       </w:tblGrid>
       <w:tr>
-        <w:tblPrEx>
-          <w:tblCellMar>
-            <w:top w:w="0" w:type="dxa"/>
-            <w:bottom w:w="0" w:type="dxa"/>
-          </w:tblCellMar>
-        </w:tblPrEx>
         <w:trPr>
           <w:tblHeader/>
         </w:trPr>
@@ -256,12 +434,6 @@
         </w:tc>
       </w:tr>
       <w:tr>
-        <w:tblPrEx>
-          <w:tblCellMar>
-            <w:top w:w="0" w:type="dxa"/>
-            <w:bottom w:w="0" w:type="dxa"/>
-          </w:tblCellMar>
-        </w:tblPrEx>
         <w:tc>
           <w:tcPr>
             <w:tcW w:w="2200" w:type="dxa"/>
@@ -337,12 +509,6 @@
         </w:tc>
       </w:tr>
       <w:tr>
-        <w:tblPrEx>
-          <w:tblCellMar>
-            <w:top w:w="0" w:type="dxa"/>
-            <w:bottom w:w="0" w:type="dxa"/>
-          </w:tblCellMar>
-        </w:tblPrEx>
         <w:tc>
           <w:tcPr>
             <w:tcW w:w="2200" w:type="dxa"/>
@@ -394,12 +560,6 @@
         </w:tc>
       </w:tr>
       <w:tr>
-        <w:tblPrEx>
-          <w:tblCellMar>
-            <w:top w:w="0" w:type="dxa"/>
-            <w:bottom w:w="0" w:type="dxa"/>
-          </w:tblCellMar>
-        </w:tblPrEx>
         <w:tc>
           <w:tcPr>
             <w:tcW w:w="2200" w:type="dxa"/>
@@ -868,24 +1028,9 @@
     </w:p>
     <w:p>
       <w:pPr>
-        <w:rPr>
-          <w:b/>
-          <w:bCs/>
-          <w:color w:val="1F3864"/>
-          <w:sz w:val="30"/>
-          <w:szCs w:val="30"/>
-        </w:rPr>
-      </w:pPr>
-      <w:r>
-        <w:br w:type="page"/>
-      </w:r>
-    </w:p>
-    <w:p>
-      <w:pPr>
         <w:pStyle w:val="Heading1"/>
       </w:pPr>
       <w:r>
-        <w:lastRenderedPageBreak/>
         <w:t>4. Stage @2: select and output</w:t>
       </w:r>
     </w:p>
@@ -1179,12 +1324,6 @@
         <w:gridCol w:w="7026"/>
       </w:tblGrid>
       <w:tr>
-        <w:tblPrEx>
-          <w:tblCellMar>
-            <w:top w:w="0" w:type="dxa"/>
-            <w:bottom w:w="0" w:type="dxa"/>
-          </w:tblCellMar>
-        </w:tblPrEx>
         <w:trPr>
           <w:tblHeader/>
         </w:trPr>
@@ -1244,12 +1383,6 @@
         </w:tc>
       </w:tr>
       <w:tr>
-        <w:tblPrEx>
-          <w:tblCellMar>
-            <w:top w:w="0" w:type="dxa"/>
-            <w:bottom w:w="0" w:type="dxa"/>
-          </w:tblCellMar>
-        </w:tblPrEx>
         <w:tc>
           <w:tcPr>
             <w:tcW w:w="2000" w:type="dxa"/>
@@ -1306,12 +1439,6 @@
         </w:tc>
       </w:tr>
       <w:tr>
-        <w:tblPrEx>
-          <w:tblCellMar>
-            <w:top w:w="0" w:type="dxa"/>
-            <w:bottom w:w="0" w:type="dxa"/>
-          </w:tblCellMar>
-        </w:tblPrEx>
         <w:tc>
           <w:tcPr>
             <w:tcW w:w="2000" w:type="dxa"/>
@@ -1368,12 +1495,6 @@
         </w:tc>
       </w:tr>
       <w:tr>
-        <w:tblPrEx>
-          <w:tblCellMar>
-            <w:top w:w="0" w:type="dxa"/>
-            <w:bottom w:w="0" w:type="dxa"/>
-          </w:tblCellMar>
-        </w:tblPrEx>
         <w:tc>
           <w:tcPr>
             <w:tcW w:w="2000" w:type="dxa"/>
@@ -1430,12 +1551,6 @@
         </w:tc>
       </w:tr>
       <w:tr>
-        <w:tblPrEx>
-          <w:tblCellMar>
-            <w:top w:w="0" w:type="dxa"/>
-            <w:bottom w:w="0" w:type="dxa"/>
-          </w:tblCellMar>
-        </w:tblPrEx>
         <w:tc>
           <w:tcPr>
             <w:tcW w:w="2000" w:type="dxa"/>
@@ -1506,11 +1621,6 @@
       <w:pPr>
         <w:spacing w:after="120"/>
       </w:pPr>
-    </w:p>
-    <w:p>
-      <w:pPr>
-        <w:spacing w:after="120"/>
-      </w:pPr>
       <w:proofErr w:type="gramStart"/>
       <w:r>
         <w:rPr>
@@ -1518,6 +1628,7 @@
           <w:sz w:val="20"/>
           <w:szCs w:val="20"/>
         </w:rPr>
+        <w:lastRenderedPageBreak/>
         <w:t>!$</w:t>
       </w:r>
       <w:proofErr w:type="gramEnd"/>
@@ -1610,12 +1721,6 @@
         <w:gridCol w:w="2226"/>
       </w:tblGrid>
       <w:tr>
-        <w:tblPrEx>
-          <w:tblCellMar>
-            <w:top w:w="0" w:type="dxa"/>
-            <w:bottom w:w="0" w:type="dxa"/>
-          </w:tblCellMar>
-        </w:tblPrEx>
         <w:trPr>
           <w:tblHeader/>
         </w:trPr>
@@ -1783,12 +1888,6 @@
         </w:tc>
       </w:tr>
       <w:tr>
-        <w:tblPrEx>
-          <w:tblCellMar>
-            <w:top w:w="0" w:type="dxa"/>
-            <w:bottom w:w="0" w:type="dxa"/>
-          </w:tblCellMar>
-        </w:tblPrEx>
         <w:tc>
           <w:tcPr>
             <w:tcW w:w="1200" w:type="dxa"/>
@@ -1923,12 +2022,6 @@
         </w:tc>
       </w:tr>
       <w:tr>
-        <w:tblPrEx>
-          <w:tblCellMar>
-            <w:top w:w="0" w:type="dxa"/>
-            <w:bottom w:w="0" w:type="dxa"/>
-          </w:tblCellMar>
-        </w:tblPrEx>
         <w:tc>
           <w:tcPr>
             <w:tcW w:w="1200" w:type="dxa"/>
@@ -2063,12 +2156,6 @@
         </w:tc>
       </w:tr>
       <w:tr>
-        <w:tblPrEx>
-          <w:tblCellMar>
-            <w:top w:w="0" w:type="dxa"/>
-            <w:bottom w:w="0" w:type="dxa"/>
-          </w:tblCellMar>
-        </w:tblPrEx>
         <w:tc>
           <w:tcPr>
             <w:tcW w:w="1200" w:type="dxa"/>
@@ -2203,12 +2290,6 @@
         </w:tc>
       </w:tr>
       <w:tr>
-        <w:tblPrEx>
-          <w:tblCellMar>
-            <w:top w:w="0" w:type="dxa"/>
-            <w:bottom w:w="0" w:type="dxa"/>
-          </w:tblCellMar>
-        </w:tblPrEx>
         <w:tc>
           <w:tcPr>
             <w:tcW w:w="1200" w:type="dxa"/>
@@ -2343,12 +2424,6 @@
         </w:tc>
       </w:tr>
       <w:tr>
-        <w:tblPrEx>
-          <w:tblCellMar>
-            <w:top w:w="0" w:type="dxa"/>
-            <w:bottom w:w="0" w:type="dxa"/>
-          </w:tblCellMar>
-        </w:tblPrEx>
         <w:tc>
           <w:tcPr>
             <w:tcW w:w="1200" w:type="dxa"/>
@@ -2483,12 +2558,6 @@
         </w:tc>
       </w:tr>
       <w:tr>
-        <w:tblPrEx>
-          <w:tblCellMar>
-            <w:top w:w="0" w:type="dxa"/>
-            <w:bottom w:w="0" w:type="dxa"/>
-          </w:tblCellMar>
-        </w:tblPrEx>
         <w:tc>
           <w:tcPr>
             <w:tcW w:w="1200" w:type="dxa"/>
@@ -2623,12 +2692,6 @@
         </w:tc>
       </w:tr>
       <w:tr>
-        <w:tblPrEx>
-          <w:tblCellMar>
-            <w:top w:w="0" w:type="dxa"/>
-            <w:bottom w:w="0" w:type="dxa"/>
-          </w:tblCellMar>
-        </w:tblPrEx>
         <w:tc>
           <w:tcPr>
             <w:tcW w:w="1200" w:type="dxa"/>
@@ -2765,12 +2828,6 @@
         </w:tc>
       </w:tr>
       <w:tr>
-        <w:tblPrEx>
-          <w:tblCellMar>
-            <w:top w:w="0" w:type="dxa"/>
-            <w:bottom w:w="0" w:type="dxa"/>
-          </w:tblCellMar>
-        </w:tblPrEx>
         <w:tc>
           <w:tcPr>
             <w:tcW w:w="1200" w:type="dxa"/>
@@ -2922,24 +2979,9 @@
     </w:p>
     <w:p>
       <w:pPr>
-        <w:rPr>
-          <w:b/>
-          <w:bCs/>
-          <w:color w:val="1F3864"/>
-          <w:sz w:val="30"/>
-          <w:szCs w:val="30"/>
-        </w:rPr>
-      </w:pPr>
-      <w:r>
-        <w:br w:type="page"/>
-      </w:r>
-    </w:p>
-    <w:p>
-      <w:pPr>
         <w:pStyle w:val="Heading1"/>
       </w:pPr>
       <w:r>
-        <w:lastRenderedPageBreak/>
         <w:t>7. Simulation control</w:t>
       </w:r>
     </w:p>
@@ -3141,7 +3183,7 @@
       </w:r>
     </w:p>
     <w:sectPr>
-      <w:footerReference w:type="default" r:id="rId9"/>
+      <w:footerReference w:type="default" r:id="rId11"/>
       <w:pgSz w:w="11906" w:h="16838"/>
       <w:pgMar w:top="1440" w:right="1440" w:bottom="1440" w:left="1440" w:header="708" w:footer="708" w:gutter="0"/>
       <w:cols w:space="720"/>

</xml_diff>